<commit_message>
adding updated values to summary
</commit_message>
<xml_diff>
--- a/Summary.docx
+++ b/Summary.docx
@@ -39,6 +39,12 @@
       <w:r>
         <w:t xml:space="preserve">USC ID/s: </w:t>
       </w:r>
+      <w:r>
+        <w:t>8837304797</w:t>
+      </w:r>
+      <w:r>
+        <w:t>, 1164925635, 8423896373</w:t>
+      </w:r>
     </w:p>
     <w:p/>
     <w:p>
@@ -79,11 +85,11 @@
         <w:tblLook w:val="04A0" w:firstRow="1" w:lastRow="0" w:firstColumn="1" w:lastColumn="0" w:noHBand="0" w:noVBand="1"/>
       </w:tblPr>
       <w:tblGrid>
-        <w:gridCol w:w="1324"/>
+        <w:gridCol w:w="1270"/>
+        <w:gridCol w:w="2467"/>
         <w:gridCol w:w="2345"/>
-        <w:gridCol w:w="2345"/>
-        <w:gridCol w:w="1476"/>
-        <w:gridCol w:w="1525"/>
+        <w:gridCol w:w="1439"/>
+        <w:gridCol w:w="1494"/>
       </w:tblGrid>
       <w:tr>
         <w:tc>
@@ -154,17 +160,20 @@
           </w:tcPr>
           <w:p>
             <w:r>
-              <w:t>0.1418590545654297</w:t>
-            </w:r>
-          </w:p>
-        </w:tc>
-        <w:tc>
-          <w:tcPr>
-            <w:tcW w:w="1803" w:type="dxa"/>
-          </w:tcPr>
-          <w:p>
-            <w:r>
-              <w:t>0.1499652862548828</w:t>
+              <w:t>0.</w:t>
+            </w:r>
+            <w:r>
+              <w:t>16999244689941406</w:t>
+            </w:r>
+          </w:p>
+        </w:tc>
+        <w:tc>
+          <w:tcPr>
+            <w:tcW w:w="1803" w:type="dxa"/>
+          </w:tcPr>
+          <w:p>
+            <w:r>
+              <w:t>0.3247261047363281</w:t>
             </w:r>
           </w:p>
         </w:tc>
@@ -206,17 +215,17 @@
           </w:tcPr>
           <w:p>
             <w:r>
-              <w:t>0.6346702575683594</w:t>
-            </w:r>
-          </w:p>
-        </w:tc>
-        <w:tc>
-          <w:tcPr>
-            <w:tcW w:w="1803" w:type="dxa"/>
-          </w:tcPr>
-          <w:p>
-            <w:r>
-              <w:t>0.80108642578125</w:t>
+              <w:t>0.5180835723876953</w:t>
+            </w:r>
+          </w:p>
+        </w:tc>
+        <w:tc>
+          <w:tcPr>
+            <w:tcW w:w="1803" w:type="dxa"/>
+          </w:tcPr>
+          <w:p>
+            <w:r>
+              <w:t>1.359701156616211</w:t>
             </w:r>
           </w:p>
         </w:tc>
@@ -258,27 +267,27 @@
           </w:tcPr>
           <w:p>
             <w:r>
-              <w:t>3.083944320678711</w:t>
-            </w:r>
-          </w:p>
-        </w:tc>
-        <w:tc>
-          <w:tcPr>
-            <w:tcW w:w="1803" w:type="dxa"/>
-          </w:tcPr>
-          <w:p>
-            <w:r>
-              <w:t>3.628253936767578</w:t>
-            </w:r>
-          </w:p>
-        </w:tc>
-        <w:tc>
-          <w:tcPr>
-            <w:tcW w:w="1803" w:type="dxa"/>
-          </w:tcPr>
-          <w:p>
-            <w:r>
-              <w:t>512</w:t>
+              <w:t>1.4209747314453125</w:t>
+            </w:r>
+          </w:p>
+        </w:tc>
+        <w:tc>
+          <w:tcPr>
+            <w:tcW w:w="1803" w:type="dxa"/>
+          </w:tcPr>
+          <w:p>
+            <w:r>
+              <w:t>2.5610923767089844</w:t>
+            </w:r>
+          </w:p>
+        </w:tc>
+        <w:tc>
+          <w:tcPr>
+            <w:tcW w:w="1803" w:type="dxa"/>
+          </w:tcPr>
+          <w:p>
+            <w:r>
+              <w:t>560</w:t>
             </w:r>
           </w:p>
         </w:tc>
@@ -310,27 +319,27 @@
           </w:tcPr>
           <w:p>
             <w:r>
-              <w:t>9.050130844116211</w:t>
-            </w:r>
-          </w:p>
-        </w:tc>
-        <w:tc>
-          <w:tcPr>
-            <w:tcW w:w="1803" w:type="dxa"/>
-          </w:tcPr>
-          <w:p>
-            <w:r>
-              <w:t>11.045217514038086</w:t>
-            </w:r>
-          </w:p>
-        </w:tc>
-        <w:tc>
-          <w:tcPr>
-            <w:tcW w:w="1803" w:type="dxa"/>
-          </w:tcPr>
-          <w:p>
-            <w:r>
-              <w:t>2592</w:t>
+              <w:t>6.19196891784668</w:t>
+            </w:r>
+          </w:p>
+        </w:tc>
+        <w:tc>
+          <w:tcPr>
+            <w:tcW w:w="1803" w:type="dxa"/>
+          </w:tcPr>
+          <w:p>
+            <w:r>
+              <w:t>6.490945816040039</w:t>
+            </w:r>
+          </w:p>
+        </w:tc>
+        <w:tc>
+          <w:tcPr>
+            <w:tcW w:w="1803" w:type="dxa"/>
+          </w:tcPr>
+          <w:p>
+            <w:r>
+              <w:t>2608</w:t>
             </w:r>
           </w:p>
         </w:tc>
@@ -362,17 +371,17 @@
           </w:tcPr>
           <w:p>
             <w:r>
-              <w:t>19.495010375976562</w:t>
-            </w:r>
-          </w:p>
-        </w:tc>
-        <w:tc>
-          <w:tcPr>
-            <w:tcW w:w="1803" w:type="dxa"/>
-          </w:tcPr>
-          <w:p>
-            <w:r>
-              <w:t>24.651050567626953</w:t>
+              <w:t>12.666940689086914</w:t>
+            </w:r>
+          </w:p>
+        </w:tc>
+        <w:tc>
+          <w:tcPr>
+            <w:tcW w:w="1803" w:type="dxa"/>
+          </w:tcPr>
+          <w:p>
+            <w:r>
+              <w:t>12.920856475830078</w:t>
             </w:r>
           </w:p>
         </w:tc>
@@ -414,27 +423,27 @@
           </w:tcPr>
           <w:p>
             <w:r>
-              <w:t>34.49678421020508</w:t>
-            </w:r>
-          </w:p>
-        </w:tc>
-        <w:tc>
-          <w:tcPr>
-            <w:tcW w:w="1803" w:type="dxa"/>
-          </w:tcPr>
-          <w:p>
-            <w:r>
-              <w:t>44.04187202453613</w:t>
-            </w:r>
-          </w:p>
-        </w:tc>
-        <w:tc>
-          <w:tcPr>
-            <w:tcW w:w="1803" w:type="dxa"/>
-          </w:tcPr>
-          <w:p>
-            <w:r>
-              <w:t>11184</w:t>
+              <w:t>21.51775360107422</w:t>
+            </w:r>
+          </w:p>
+        </w:tc>
+        <w:tc>
+          <w:tcPr>
+            <w:tcW w:w="1803" w:type="dxa"/>
+          </w:tcPr>
+          <w:p>
+            <w:r>
+              <w:t>26.89194679260254</w:t>
+            </w:r>
+          </w:p>
+        </w:tc>
+        <w:tc>
+          <w:tcPr>
+            <w:tcW w:w="1803" w:type="dxa"/>
+          </w:tcPr>
+          <w:p>
+            <w:r>
+              <w:t>11152</w:t>
             </w:r>
           </w:p>
         </w:tc>
@@ -444,7 +453,7 @@
           </w:tcPr>
           <w:p>
             <w:r>
-              <w:t>48</w:t>
+              <w:t>144</w:t>
             </w:r>
           </w:p>
         </w:tc>
@@ -466,27 +475,27 @@
           </w:tcPr>
           <w:p>
             <w:r>
-              <w:t>79.91504669189453</w:t>
-            </w:r>
-          </w:p>
-        </w:tc>
-        <w:tc>
-          <w:tcPr>
-            <w:tcW w:w="1803" w:type="dxa"/>
-          </w:tcPr>
-          <w:p>
-            <w:r>
-              <w:t>111.97423934936523</w:t>
-            </w:r>
-          </w:p>
-        </w:tc>
-        <w:tc>
-          <w:tcPr>
-            <w:tcW w:w="1803" w:type="dxa"/>
-          </w:tcPr>
-          <w:p>
-            <w:r>
-              <w:t>25712</w:t>
+              <w:t>61.32769584655762</w:t>
+            </w:r>
+          </w:p>
+        </w:tc>
+        <w:tc>
+          <w:tcPr>
+            <w:tcW w:w="1803" w:type="dxa"/>
+          </w:tcPr>
+          <w:p>
+            <w:r>
+              <w:t>59.250831604003906</w:t>
+            </w:r>
+          </w:p>
+        </w:tc>
+        <w:tc>
+          <w:tcPr>
+            <w:tcW w:w="1803" w:type="dxa"/>
+          </w:tcPr>
+          <w:p>
+            <w:r>
+              <w:t>25584</w:t>
             </w:r>
           </w:p>
         </w:tc>
@@ -496,7 +505,7 @@
           </w:tcPr>
           <w:p>
             <w:r>
-              <w:t>64</w:t>
+              <w:t>208</w:t>
             </w:r>
           </w:p>
         </w:tc>
@@ -518,27 +527,27 @@
           </w:tcPr>
           <w:p>
             <w:r>
-              <w:t>233.09588432312012</w:t>
-            </w:r>
-          </w:p>
-        </w:tc>
-        <w:tc>
-          <w:tcPr>
-            <w:tcW w:w="1803" w:type="dxa"/>
-          </w:tcPr>
-          <w:p>
-            <w:r>
-              <w:t>172.332763671875</w:t>
-            </w:r>
-          </w:p>
-        </w:tc>
-        <w:tc>
-          <w:tcPr>
-            <w:tcW w:w="1803" w:type="dxa"/>
-          </w:tcPr>
-          <w:p>
-            <w:r>
-              <w:t>47120</w:t>
+              <w:t>123.77500534057617</w:t>
+            </w:r>
+          </w:p>
+        </w:tc>
+        <w:tc>
+          <w:tcPr>
+            <w:tcW w:w="1803" w:type="dxa"/>
+          </w:tcPr>
+          <w:p>
+            <w:r>
+              <w:t>93.54805946350098</w:t>
+            </w:r>
+          </w:p>
+        </w:tc>
+        <w:tc>
+          <w:tcPr>
+            <w:tcW w:w="1803" w:type="dxa"/>
+          </w:tcPr>
+          <w:p>
+            <w:r>
+              <w:t>49264</w:t>
             </w:r>
           </w:p>
         </w:tc>
@@ -548,7 +557,7 @@
           </w:tcPr>
           <w:p>
             <w:r>
-              <w:t>112</w:t>
+              <w:t>144</w:t>
             </w:r>
           </w:p>
         </w:tc>
@@ -570,27 +579,27 @@
           </w:tcPr>
           <w:p>
             <w:r>
-              <w:t>258.61668586730957</w:t>
-            </w:r>
-          </w:p>
-        </w:tc>
-        <w:tc>
-          <w:tcPr>
-            <w:tcW w:w="1803" w:type="dxa"/>
-          </w:tcPr>
-          <w:p>
-            <w:r>
-              <w:t>265.549898147583</w:t>
-            </w:r>
-          </w:p>
-        </w:tc>
-        <w:tc>
-          <w:tcPr>
-            <w:tcW w:w="1803" w:type="dxa"/>
-          </w:tcPr>
-          <w:p>
-            <w:r>
-              <w:t>87792</w:t>
+              <w:t>185.21404266357422</w:t>
+            </w:r>
+          </w:p>
+        </w:tc>
+        <w:tc>
+          <w:tcPr>
+            <w:tcW w:w="1803" w:type="dxa"/>
+          </w:tcPr>
+          <w:p>
+            <w:r>
+              <w:t>137.53080368041992</w:t>
+            </w:r>
+          </w:p>
+        </w:tc>
+        <w:tc>
+          <w:tcPr>
+            <w:tcW w:w="1803" w:type="dxa"/>
+          </w:tcPr>
+          <w:p>
+            <w:r>
+              <w:t>87280</w:t>
             </w:r>
           </w:p>
         </w:tc>
@@ -600,7 +609,7 @@
           </w:tcPr>
           <w:p>
             <w:r>
-              <w:t>144</w:t>
+              <w:t>304</w:t>
             </w:r>
           </w:p>
         </w:tc>
@@ -622,27 +631,27 @@
           </w:tcPr>
           <w:p>
             <w:r>
-              <w:t>368.18838119506836</w:t>
-            </w:r>
-          </w:p>
-        </w:tc>
-        <w:tc>
-          <w:tcPr>
-            <w:tcW w:w="1803" w:type="dxa"/>
-          </w:tcPr>
-          <w:p>
-            <w:r>
-              <w:t>359.2700958251953</w:t>
-            </w:r>
-          </w:p>
-        </w:tc>
-        <w:tc>
-          <w:tcPr>
-            <w:tcW w:w="1803" w:type="dxa"/>
-          </w:tcPr>
-          <w:p>
-            <w:r>
-              <w:t>78112</w:t>
+              <w:t>264.79578018188477</w:t>
+            </w:r>
+          </w:p>
+        </w:tc>
+        <w:tc>
+          <w:tcPr>
+            <w:tcW w:w="1803" w:type="dxa"/>
+          </w:tcPr>
+          <w:p>
+            <w:r>
+              <w:t>182.82485008239746</w:t>
+            </w:r>
+          </w:p>
+        </w:tc>
+        <w:tc>
+          <w:tcPr>
+            <w:tcW w:w="1803" w:type="dxa"/>
+          </w:tcPr>
+          <w:p>
+            <w:r>
+              <w:t>108912</w:t>
             </w:r>
           </w:p>
         </w:tc>
@@ -652,7 +661,7 @@
           </w:tcPr>
           <w:p>
             <w:r>
-              <w:t>256</w:t>
+              <w:t>384</w:t>
             </w:r>
           </w:p>
         </w:tc>
@@ -674,27 +683,27 @@
           </w:tcPr>
           <w:p>
             <w:r>
-              <w:t>670.7348823547363</w:t>
-            </w:r>
-          </w:p>
-        </w:tc>
-        <w:tc>
-          <w:tcPr>
-            <w:tcW w:w="1803" w:type="dxa"/>
-          </w:tcPr>
-          <w:p>
-            <w:r>
-              <w:t>680.6051731109619</w:t>
-            </w:r>
-          </w:p>
-        </w:tc>
-        <w:tc>
-          <w:tcPr>
-            <w:tcW w:w="1803" w:type="dxa"/>
-          </w:tcPr>
-          <w:p>
-            <w:r>
-              <w:t>156720</w:t>
+              <w:t>545.9740161895752</w:t>
+            </w:r>
+          </w:p>
+        </w:tc>
+        <w:tc>
+          <w:tcPr>
+            <w:tcW w:w="1803" w:type="dxa"/>
+          </w:tcPr>
+          <w:p>
+            <w:r>
+              <w:t>345.96729278564453</w:t>
+            </w:r>
+          </w:p>
+        </w:tc>
+        <w:tc>
+          <w:tcPr>
+            <w:tcW w:w="1803" w:type="dxa"/>
+          </w:tcPr>
+          <w:p>
+            <w:r>
+              <w:t>205520</w:t>
             </w:r>
           </w:p>
         </w:tc>
@@ -704,7 +713,7 @@
           </w:tcPr>
           <w:p>
             <w:r>
-              <w:t>288</w:t>
+              <w:t>416</w:t>
             </w:r>
           </w:p>
         </w:tc>
@@ -726,27 +735,27 @@
           </w:tcPr>
           <w:p>
             <w:r>
-              <w:t>1142.6491737365723</w:t>
-            </w:r>
-          </w:p>
-        </w:tc>
-        <w:tc>
-          <w:tcPr>
-            <w:tcW w:w="1803" w:type="dxa"/>
-          </w:tcPr>
-          <w:p>
-            <w:r>
-              <w:t>1086.5740776062012</w:t>
-            </w:r>
-          </w:p>
-        </w:tc>
-        <w:tc>
-          <w:tcPr>
-            <w:tcW w:w="1803" w:type="dxa"/>
-          </w:tcPr>
-          <w:p>
-            <w:r>
-              <w:t>227904</w:t>
+              <w:t>908.2441329956055</w:t>
+            </w:r>
+          </w:p>
+        </w:tc>
+        <w:tc>
+          <w:tcPr>
+            <w:tcW w:w="1803" w:type="dxa"/>
+          </w:tcPr>
+          <w:p>
+            <w:r>
+              <w:t>523.4401226043701</w:t>
+            </w:r>
+          </w:p>
+        </w:tc>
+        <w:tc>
+          <w:tcPr>
+            <w:tcW w:w="1803" w:type="dxa"/>
+          </w:tcPr>
+          <w:p>
+            <w:r>
+              <w:t>359472</w:t>
             </w:r>
           </w:p>
         </w:tc>
@@ -756,7 +765,7 @@
           </w:tcPr>
           <w:p>
             <w:r>
-              <w:t>-432</w:t>
+              <w:t>496</w:t>
             </w:r>
           </w:p>
         </w:tc>
@@ -778,27 +787,27 @@
           </w:tcPr>
           <w:p>
             <w:r>
-              <w:t>1530.8749675750732</w:t>
-            </w:r>
-          </w:p>
-        </w:tc>
-        <w:tc>
-          <w:tcPr>
-            <w:tcW w:w="1803" w:type="dxa"/>
-          </w:tcPr>
-          <w:p>
-            <w:r>
-              <w:t>1433.161973953247</w:t>
-            </w:r>
-          </w:p>
-        </w:tc>
-        <w:tc>
-          <w:tcPr>
-            <w:tcW w:w="1803" w:type="dxa"/>
-          </w:tcPr>
-          <w:p>
-            <w:r>
-              <w:t>261472</w:t>
+              <w:t>1257.2619915008545</w:t>
+            </w:r>
+          </w:p>
+        </w:tc>
+        <w:tc>
+          <w:tcPr>
+            <w:tcW w:w="1803" w:type="dxa"/>
+          </w:tcPr>
+          <w:p>
+            <w:r>
+              <w:t>712.1038436889648</w:t>
+            </w:r>
+          </w:p>
+        </w:tc>
+        <w:tc>
+          <w:tcPr>
+            <w:tcW w:w="1803" w:type="dxa"/>
+          </w:tcPr>
+          <w:p>
+            <w:r>
+              <w:t>427664</w:t>
             </w:r>
           </w:p>
         </w:tc>
@@ -808,7 +817,7 @@
           </w:tcPr>
           <w:p>
             <w:r>
-              <w:t>432</w:t>
+              <w:t>544</w:t>
             </w:r>
           </w:p>
         </w:tc>
@@ -830,27 +839,27 @@
           </w:tcPr>
           <w:p>
             <w:r>
-              <w:t>2192.6982402801514</w:t>
-            </w:r>
-          </w:p>
-        </w:tc>
-        <w:tc>
-          <w:tcPr>
-            <w:tcW w:w="1803" w:type="dxa"/>
-          </w:tcPr>
-          <w:p>
-            <w:r>
-              <w:t>2277.9459953308105</w:t>
-            </w:r>
-          </w:p>
-        </w:tc>
-        <w:tc>
-          <w:tcPr>
-            <w:tcW w:w="1803" w:type="dxa"/>
-          </w:tcPr>
-          <w:p>
-            <w:r>
-              <w:t>302320</w:t>
+              <w:t>1652.2021293640137</w:t>
+            </w:r>
+          </w:p>
+        </w:tc>
+        <w:tc>
+          <w:tcPr>
+            <w:tcW w:w="1803" w:type="dxa"/>
+          </w:tcPr>
+          <w:p>
+            <w:r>
+              <w:t>1008.7800025939941</w:t>
+            </w:r>
+          </w:p>
+        </w:tc>
+        <w:tc>
+          <w:tcPr>
+            <w:tcW w:w="1803" w:type="dxa"/>
+          </w:tcPr>
+          <w:p>
+            <w:r>
+              <w:t>407168</w:t>
             </w:r>
           </w:p>
         </w:tc>
@@ -860,7 +869,7 @@
           </w:tcPr>
           <w:p>
             <w:r>
-              <w:t>-3584</w:t>
+              <w:t>608</w:t>
             </w:r>
           </w:p>
         </w:tc>
@@ -882,27 +891,27 @@
           </w:tcPr>
           <w:p>
             <w:r>
-              <w:t>2734.6041202545166</w:t>
-            </w:r>
-          </w:p>
-        </w:tc>
-        <w:tc>
-          <w:tcPr>
-            <w:tcW w:w="1803" w:type="dxa"/>
-          </w:tcPr>
-          <w:p>
-            <w:r>
-              <w:t>2506.6280364990234</w:t>
-            </w:r>
-          </w:p>
-        </w:tc>
-        <w:tc>
-          <w:tcPr>
-            <w:tcW w:w="1803" w:type="dxa"/>
-          </w:tcPr>
-          <w:p>
-            <w:r>
-              <w:t>337920</w:t>
+              <w:t>2461.994171142578</w:t>
+            </w:r>
+          </w:p>
+        </w:tc>
+        <w:tc>
+          <w:tcPr>
+            <w:tcW w:w="1803" w:type="dxa"/>
+          </w:tcPr>
+          <w:p>
+            <w:r>
+              <w:t>1467.2420024871826</w:t>
+            </w:r>
+          </w:p>
+        </w:tc>
+        <w:tc>
+          <w:tcPr>
+            <w:tcW w:w="1803" w:type="dxa"/>
+          </w:tcPr>
+          <w:p>
+            <w:r>
+              <w:t>519808</w:t>
             </w:r>
           </w:p>
         </w:tc>
@@ -912,7 +921,7 @@
           </w:tcPr>
           <w:p>
             <w:r>
-              <w:t>-480</w:t>
+              <w:t>640</w:t>
             </w:r>
           </w:p>
         </w:tc>
@@ -943,10 +952,10 @@
           <w:noProof/>
         </w:rPr>
         <w:drawing>
-          <wp:inline distT="0" distB="0" distL="0" distR="0" wp14:anchorId="6ABE3A6C" wp14:editId="2A5E56FE">
-            <wp:extent cx="5731510" cy="4716145"/>
-            <wp:effectExtent l="0" t="0" r="2540" b="8255"/>
-            <wp:docPr id="1441061910" name="Picture 3"/>
+          <wp:inline distT="0" distB="0" distL="0" distR="0" wp14:anchorId="349313C5" wp14:editId="0886BBEE">
+            <wp:extent cx="5731510" cy="4673600"/>
+            <wp:effectExtent l="0" t="0" r="0" b="0"/>
+            <wp:docPr id="1999789918" name="Picture 2"/>
             <wp:cNvGraphicFramePr>
               <a:graphicFrameLocks xmlns:a="http://schemas.openxmlformats.org/drawingml/2006/main" noChangeAspect="1"/>
             </wp:cNvGraphicFramePr>
@@ -954,7 +963,7 @@
               <a:graphicData uri="http://schemas.openxmlformats.org/drawingml/2006/picture">
                 <pic:pic xmlns:pic="http://schemas.openxmlformats.org/drawingml/2006/picture">
                   <pic:nvPicPr>
-                    <pic:cNvPr id="1441061910" name="Picture 1441061910"/>
+                    <pic:cNvPr id="1999789918" name="Picture 1999789918"/>
                     <pic:cNvPicPr/>
                   </pic:nvPicPr>
                   <pic:blipFill>
@@ -972,7 +981,7 @@
                   <pic:spPr>
                     <a:xfrm>
                       <a:off x="0" y="0"/>
-                      <a:ext cx="5731510" cy="4716145"/>
+                      <a:ext cx="5731510" cy="4673600"/>
                     </a:xfrm>
                     <a:prstGeom prst="rect">
                       <a:avLst/>
@@ -1021,7 +1030,37 @@
     <w:p/>
     <w:p>
       <w:r>
-        <w:t>For the basic algorithm, the entire (M+1) × (N+1) DP table is stored in memory, giving a theoretical space complexity of Θ(M×N). This is clearly visible in our graph — the basic curve grows in a quadratic/polynomial fashion. We can verify this using our datapoints: when the problem size doubles from 1024 to 2048, the basic memory grows from 47,120 KB to 156,720 KB, which is roughly 3-4x more, consistent with quadratic growth rather than linear (which would only double).</w:t>
+        <w:t xml:space="preserve">For the basic algorithm, the entire (M+1) × (N+1) DP table is stored in memory, giving a theoretical space complexity of Θ(M×N). This is clearly visible in our graph — the basic curve grows in a quadratic/polynomial fashion. We can verify this using our datapoints: when the problem size doubles from 1024 to 2048, the basic memory grows from </w:t>
+      </w:r>
+      <w:r>
+        <w:t>49</w:t>
+      </w:r>
+      <w:r>
+        <w:t>,</w:t>
+      </w:r>
+      <w:r>
+        <w:t>264</w:t>
+      </w:r>
+      <w:r>
+        <w:t xml:space="preserve"> KB to </w:t>
+      </w:r>
+      <w:r>
+        <w:t>205</w:t>
+      </w:r>
+      <w:r>
+        <w:t>,</w:t>
+      </w:r>
+      <w:r>
+        <w:t>520</w:t>
+      </w:r>
+      <w:r>
+        <w:t xml:space="preserve"> KB, which is roughly </w:t>
+      </w:r>
+      <w:r>
+        <w:t>4</w:t>
+      </w:r>
+      <w:r>
+        <w:t>x more, consistent with quadratic growth rather than linear (which would only double).</w:t>
       </w:r>
     </w:p>
     <w:p>
@@ -1038,7 +1077,13 @@
       </w:r>
       <w:proofErr w:type="spellEnd"/>
       <w:r>
-        <w:t xml:space="preserve">=256 and 432 KB at </w:t>
+        <w:t xml:space="preserve">=256 and </w:t>
+      </w:r>
+      <w:r>
+        <w:t>640</w:t>
+      </w:r>
+      <w:r>
+        <w:t xml:space="preserve"> KB at </w:t>
       </w:r>
       <w:proofErr w:type="spellStart"/>
       <w:r>
@@ -1046,7 +1091,25 @@
       </w:r>
       <w:proofErr w:type="spellEnd"/>
       <w:r>
-        <w:t xml:space="preserve">=3072 — barely any difference despite a 12x increase in problem size. The small fluctuations are due to Python runtime overhead rather than actual algorithmic scaling. This near-constant </w:t>
+        <w:t>=</w:t>
+      </w:r>
+      <w:r>
+        <w:t>3968</w:t>
+      </w:r>
+      <w:r>
+        <w:t xml:space="preserve"> — barely a</w:t>
+      </w:r>
+      <w:r>
+        <w:t xml:space="preserve"> 20x</w:t>
+      </w:r>
+      <w:r>
+        <w:t xml:space="preserve"> difference despite a 12</w:t>
+      </w:r>
+      <w:r>
+        <w:t>4</w:t>
+      </w:r>
+      <w:r>
+        <w:t xml:space="preserve">x increase in problem size. The small fluctuations are due to Python runtime overhead rather than actual algorithmic scaling. This near-constant </w:t>
       </w:r>
       <w:proofErr w:type="spellStart"/>
       <w:r>
@@ -1077,10 +1140,10 @@
           <w:noProof/>
         </w:rPr>
         <w:drawing>
-          <wp:inline distT="0" distB="0" distL="0" distR="0" wp14:anchorId="2C352631" wp14:editId="3070E5EA">
-            <wp:extent cx="5731510" cy="4837430"/>
-            <wp:effectExtent l="0" t="0" r="2540" b="1270"/>
-            <wp:docPr id="37179988" name="Picture 2"/>
+          <wp:inline distT="0" distB="0" distL="0" distR="0" wp14:anchorId="2C5DE387" wp14:editId="23233E2A">
+            <wp:extent cx="5731510" cy="4636770"/>
+            <wp:effectExtent l="0" t="0" r="0" b="0"/>
+            <wp:docPr id="60837144" name="Picture 1"/>
             <wp:cNvGraphicFramePr>
               <a:graphicFrameLocks xmlns:a="http://schemas.openxmlformats.org/drawingml/2006/main" noChangeAspect="1"/>
             </wp:cNvGraphicFramePr>
@@ -1088,7 +1151,7 @@
               <a:graphicData uri="http://schemas.openxmlformats.org/drawingml/2006/picture">
                 <pic:pic xmlns:pic="http://schemas.openxmlformats.org/drawingml/2006/picture">
                   <pic:nvPicPr>
-                    <pic:cNvPr id="37179988" name="Picture 37179988"/>
+                    <pic:cNvPr id="60837144" name="Picture 60837144"/>
                     <pic:cNvPicPr/>
                   </pic:nvPicPr>
                   <pic:blipFill>
@@ -1106,7 +1169,7 @@
                   <pic:spPr>
                     <a:xfrm>
                       <a:off x="0" y="0"/>
-                      <a:ext cx="5731510" cy="4837430"/>
+                      <a:ext cx="5731510" cy="4636770"/>
                     </a:xfrm>
                     <a:prstGeom prst="rect">
                       <a:avLst/>
@@ -1153,15 +1216,7 @@
     </w:p>
     <w:p>
       <w:r>
-        <w:t xml:space="preserve">The basic algorithm fills a (M+1) × (N+1) DP table once. There are Θ(M×N) cells, and filling each cell does constant time work (calculating 3 candidate costs and taking the minimum). </w:t>
-      </w:r>
-      <w:proofErr w:type="gramStart"/>
-      <w:r>
-        <w:t>So</w:t>
-      </w:r>
-      <w:proofErr w:type="gramEnd"/>
-      <w:r>
-        <w:t xml:space="preserve"> the theoretical running time is Θ(M×N). This matches with our graph: the basic curve starts near 0 </w:t>
+        <w:t xml:space="preserve">The basic algorithm fills a (M+1) × (N+1) DP table once. There are Θ(M×N) cells, and filling each cell does constant time work (calculating 3 candidate costs and taking the minimum). So the theoretical running time is Θ(M×N). This matches with our graph: the basic curve starts near 0 </w:t>
       </w:r>
       <w:proofErr w:type="spellStart"/>
       <w:r>
@@ -1169,7 +1224,13 @@
       </w:r>
       <w:proofErr w:type="spellEnd"/>
       <w:r>
-        <w:t xml:space="preserve"> and increases more than linearly as M+N grows. For example, when the problem size doubles from 1024 to 2048, the time increases from 233 </w:t>
+        <w:t xml:space="preserve"> and increases more than linearly as M+N grows. For example, when the problem size doubles from 1024 to 2048, the time increases from </w:t>
+      </w:r>
+      <w:r>
+        <w:t>123</w:t>
+      </w:r>
+      <w:r>
+        <w:t xml:space="preserve"> </w:t>
       </w:r>
       <w:proofErr w:type="spellStart"/>
       <w:r>
@@ -1177,7 +1238,13 @@
       </w:r>
       <w:proofErr w:type="spellEnd"/>
       <w:r>
-        <w:t xml:space="preserve"> to 670 </w:t>
+        <w:t xml:space="preserve"> to </w:t>
+      </w:r>
+      <w:r>
+        <w:t>546</w:t>
+      </w:r>
+      <w:r>
+        <w:t xml:space="preserve"> </w:t>
       </w:r>
       <w:proofErr w:type="spellStart"/>
       <w:r>
@@ -1185,15 +1252,18 @@
       </w:r>
       <w:proofErr w:type="spellEnd"/>
       <w:r>
-        <w:t xml:space="preserve"> (nearly </w:t>
-      </w:r>
+        <w:t xml:space="preserve"> (nearly 4</w:t>
+      </w:r>
+      <w:r>
+        <w:t>-4.5</w:t>
+      </w:r>
+      <w:r>
+        <w:t>x more), which is consistent with quadratic growth rather than linear or exponential growth.</w:t>
+      </w:r>
+    </w:p>
+    <w:p>
       <w:r>
         <w:lastRenderedPageBreak/>
-        <w:t>3-4x more), which is consistent with quadratic growth rather than linear or exponential growth.</w:t>
-      </w:r>
-    </w:p>
-    <w:p>
-      <w:r>
         <w:t xml:space="preserve">The efficient algorithm also evaluates all (M+1) × (N+1) DP states, but instead of storing the entire table, it uses divide and conquer while keeping only two rows in memory at any time. Since each DP cell still requires constant time work (computing three candidate costs and taking the minimum), the theoretical running time remains Θ(M×N). This matches what we see in the graph: the efficient curve also grows </w:t>
       </w:r>
       <w:proofErr w:type="spellStart"/>
@@ -1202,7 +1272,13 @@
       </w:r>
       <w:proofErr w:type="spellEnd"/>
       <w:r>
-        <w:t xml:space="preserve">. For example, as the problem size doubles from 1024 to 2048, the time rises from 172 </w:t>
+        <w:t xml:space="preserve">. For example, as the problem size doubles from 1024 to 2048, the time rises from </w:t>
+      </w:r>
+      <w:r>
+        <w:t>93</w:t>
+      </w:r>
+      <w:r>
+        <w:t xml:space="preserve"> </w:t>
       </w:r>
       <w:proofErr w:type="spellStart"/>
       <w:r>
@@ -1210,7 +1286,13 @@
       </w:r>
       <w:proofErr w:type="spellEnd"/>
       <w:r>
-        <w:t xml:space="preserve"> to 680 </w:t>
+        <w:t xml:space="preserve"> to </w:t>
+      </w:r>
+      <w:r>
+        <w:t>346</w:t>
+      </w:r>
+      <w:r>
+        <w:t xml:space="preserve"> </w:t>
       </w:r>
       <w:proofErr w:type="spellStart"/>
       <w:r>
@@ -1218,7 +1300,13 @@
       </w:r>
       <w:proofErr w:type="spellEnd"/>
       <w:r>
-        <w:t xml:space="preserve">, roughly a 4x increase, consistent with quadratic growth rather than linear or exponential </w:t>
+        <w:t xml:space="preserve">, roughly a </w:t>
+      </w:r>
+      <w:r>
+        <w:t>3-4</w:t>
+      </w:r>
+      <w:r>
+        <w:t xml:space="preserve">x increase, consistent with quadratic growth rather than linear or exponential </w:t>
       </w:r>
       <w:proofErr w:type="spellStart"/>
       <w:r>
@@ -1248,6 +1336,11 @@
       </w:r>
     </w:p>
     <w:p>
+      <w:pPr>
+        <w:rPr>
+          <w:color w:val="000000" w:themeColor="text1"/>
+        </w:rPr>
+      </w:pPr>
       <w:r>
         <w:t>&lt;USC ID/s&gt;: &lt;</w:t>
       </w:r>
@@ -1256,6 +1349,37 @@
           <w:color w:val="000000" w:themeColor="text1"/>
         </w:rPr>
         <w:t>Equal Contribution&gt;</w:t>
+      </w:r>
+    </w:p>
+    <w:p>
+      <w:pPr>
+        <w:rPr>
+          <w:color w:val="000000" w:themeColor="text1"/>
+        </w:rPr>
+      </w:pPr>
+    </w:p>
+    <w:p>
+      <w:r>
+        <w:t>8837304797</w:t>
+      </w:r>
+      <w:r>
+        <w:t>: Equal Contribution</w:t>
+      </w:r>
+    </w:p>
+    <w:p>
+      <w:r>
+        <w:t>1164925635</w:t>
+      </w:r>
+      <w:r>
+        <w:t>: Equal Contribution</w:t>
+      </w:r>
+    </w:p>
+    <w:p>
+      <w:r>
+        <w:t>8423896373</w:t>
+      </w:r>
+      <w:r>
+        <w:t>: Equal Contribution</w:t>
       </w:r>
     </w:p>
     <w:p/>

</xml_diff>